<commit_message>
updated the Claude Code document
</commit_message>
<xml_diff>
--- a/01. Advanced Certificate in AI Security Analyst/Advanced Certificate in AI Security Analyst.docx
+++ b/01. Advanced Certificate in AI Security Analyst/Advanced Certificate in AI Security Analyst.docx
@@ -20,7 +20,23 @@
           <w:b/>
           <w:sz w:val="22"/>
         </w:rPr>
-        <w:t>Course Write-Up (for Courses other than External Degree Programmes)</w:t>
+        <w:t xml:space="preserve">Course Write-Up (for Courses other than External Degree </w:t>
+      </w:r>
+      <w:proofErr w:type="spellStart"/>
+      <w:r>
+        <w:rPr>
+          <w:b/>
+          <w:sz w:val="22"/>
+        </w:rPr>
+        <w:t>Programmes</w:t>
+      </w:r>
+      <w:proofErr w:type="spellEnd"/>
+      <w:r>
+        <w:rPr>
+          <w:b/>
+          <w:sz w:val="22"/>
+        </w:rPr>
+        <w:t>)</w:t>
       </w:r>
     </w:p>
     <w:tbl>
@@ -179,7 +195,7 @@
               <w:rPr>
                 <w:i/>
               </w:rPr>
-              <w:t>(Curriculum self-developed by Tertiary Infotech, aligned to the CompTIA SecAI+ certification framework.)</w:t>
+              <w:t>(Curriculum self-developed by Tertiary Infotech.)</w:t>
             </w:r>
           </w:p>
         </w:tc>
@@ -264,6 +280,12 @@
               </w:rPr>
               <w:t>Tertiary Infotech</w:t>
             </w:r>
+            <w:r>
+              <w:rPr>
+                <w:b/>
+              </w:rPr>
+              <w:t xml:space="preserve"> Academy</w:t>
+            </w:r>
           </w:p>
         </w:tc>
       </w:tr>
@@ -304,7 +326,18 @@
               <w:spacing w:after="40"/>
             </w:pPr>
             <w:r>
-              <w:t>The Advanced Certificate in AI Security Analyst equips cybersecurity practitioners with the specialised skills to secure AI and machine learning (ML) systems, defend against AI-driven threats, leverage AI to enhance security operations, and govern AI responsibly in line with global regulatory frameworks. The programme is structured around the four domains of the CompTIA SecAI+ certification, with each domain delivered as a dedicated module combining live virtual instruction and hands-on practical labs.</w:t>
+              <w:t xml:space="preserve">The Advanced Certificate in AI Security Analyst equips cybersecurity practitioners with the </w:t>
+            </w:r>
+            <w:proofErr w:type="spellStart"/>
+            <w:r>
+              <w:t>specialised</w:t>
+            </w:r>
+            <w:proofErr w:type="spellEnd"/>
+            <w:r>
+              <w:t xml:space="preserve"> skills to secure AI and machine learning (ML) systems, defend against AI-driven threats, leverage AI to enhance security operations, and govern AI responsibly in line with global regulatory </w:t>
+            </w:r>
+            <w:r>
+              <w:t>frameworks.</w:t>
             </w:r>
           </w:p>
           <w:p>
@@ -312,7 +345,37 @@
               <w:spacing w:after="40"/>
             </w:pPr>
             <w:r>
-              <w:t>Upon completion, learners will be able to identify and analyse AI-specific threats, implement security controls across the AI lifecycle, automate and augment security operations using AI tooling, and apply AI governance, risk and compliance (GRC) practices.</w:t>
+              <w:t xml:space="preserve">Upon completion, learners will be able to identify and </w:t>
+            </w:r>
+            <w:proofErr w:type="spellStart"/>
+            <w:r>
+              <w:t>analyse</w:t>
+            </w:r>
+            <w:proofErr w:type="spellEnd"/>
+            <w:r>
+              <w:t xml:space="preserve"> AI-specific threats, implement security controls across the AI lifecycle, automate and augment security operations using AI tooling, and apply AI governance, risk and compliance (GRC) practices.</w:t>
+            </w:r>
+          </w:p>
+          <w:p>
+            <w:pPr>
+              <w:spacing w:after="40"/>
+              <w:rPr>
+                <w:i/>
+              </w:rPr>
+            </w:pPr>
+          </w:p>
+          <w:p>
+            <w:pPr>
+              <w:spacing w:after="40"/>
+              <w:rPr>
+                <w:iCs/>
+              </w:rPr>
+            </w:pPr>
+            <w:r>
+              <w:rPr>
+                <w:iCs/>
+              </w:rPr>
+              <w:t>Each module is consists of 10 sessions (9 teaching + 1 assessment), conducted live online for 3 days a week, 7:00 PM – 10:00 PM (3 hours per session).</w:t>
             </w:r>
           </w:p>
           <w:p>
@@ -323,7 +386,7 @@
               <w:rPr>
                 <w:i/>
               </w:rPr>
-              <w:t>Please provide the information on module and its learning objective in the following format:</w:t>
+              <w:t>:</w:t>
             </w:r>
           </w:p>
           <w:tbl>
@@ -429,18 +492,15 @@
                     <w:spacing w:after="40"/>
                   </w:pPr>
                   <w:r>
-                    <w:t>This module develops foundational understanding of AI, machine learning, deep learning and NLP concepts as applied to cybersecurity, and the ability to recognise AI-driven threats such as adversarial attacks and malicious generative AI.</w:t>
+                    <w:t xml:space="preserve">This module develops foundational understanding of AI, machine learning, deep learning and NLP concepts as applied to cybersecurity, and the ability to </w:t>
                   </w:r>
-                </w:p>
-                <w:p>
-                  <w:pPr>
-                    <w:spacing w:after="40"/>
-                  </w:pPr>
+                  <w:proofErr w:type="spellStart"/>
                   <w:r>
-                    <w:rPr>
-                      <w:b/>
-                    </w:rPr>
-                    <w:t>(10 sessions / Mon, Wed &amp; Fri / ~3.3 weeks / 3 hours per session, 7:00 PM–10:00 PM)</w:t>
+                    <w:t>recognise</w:t>
+                  </w:r>
+                  <w:proofErr w:type="spellEnd"/>
+                  <w:r>
+                    <w:t xml:space="preserve"> AI-driven threats such as adversarial attacks and malicious generative AI.</w:t>
                   </w:r>
                 </w:p>
               </w:tc>
@@ -487,17 +547,6 @@
                     <w:t>This module builds advanced skills to implement security controls that protect AI systems, data and models across on-premises, cloud and hybrid environments, and to mitigate adversarial risks targeting AI models and data pipelines.</w:t>
                   </w:r>
                 </w:p>
-                <w:p>
-                  <w:pPr>
-                    <w:spacing w:after="40"/>
-                  </w:pPr>
-                  <w:r>
-                    <w:rPr>
-                      <w:b/>
-                    </w:rPr>
-                    <w:t>(10 sessions / Mon, Wed &amp; Fri / ~3.3 weeks / 3 hours per session, 7:00 PM–10:00 PM)</w:t>
-                  </w:r>
-                </w:p>
               </w:tc>
             </w:tr>
             <w:tr>
@@ -540,17 +589,6 @@
                   </w:pPr>
                   <w:r>
                     <w:t>This module develops the ability to enhance threat detection and response using AI-driven tools, automate security workflows through event triage and alert correlation, and apply AI techniques to threat modelling and continuous monitoring.</w:t>
-                  </w:r>
-                </w:p>
-                <w:p>
-                  <w:pPr>
-                    <w:spacing w:after="40"/>
-                  </w:pPr>
-                  <w:r>
-                    <w:rPr>
-                      <w:b/>
-                    </w:rPr>
-                    <w:t>(10 sessions / Mon, Wed &amp; Fri / ~3.3 weeks / 3 hours per session, 7:00 PM–10:00 PM)</w:t>
                   </w:r>
                 </w:p>
               </w:tc>
@@ -597,18 +635,6 @@
                     <w:t>This module develops competency in applying AI governance frameworks and global regulatory requirements, integrating GRC practices throughout the AI lifecycle, and ensuring responsible AI use in alignment with GDPR and the NIST AI RMF.</w:t>
                   </w:r>
                 </w:p>
-                <w:p>
-                  <w:pPr>
-                    <w:spacing w:after="40"/>
-                  </w:pPr>
-                  <w:r>
-                    <w:rPr>
-                      <w:b/>
-                    </w:rPr>
-                    <w:lastRenderedPageBreak/>
-                    <w:t>(10 sessions / Mon, Wed &amp; Fri / ~3.3 weeks / 3 hours per session, 7:00 PM–10:00 PM)</w:t>
-                  </w:r>
-                </w:p>
               </w:tc>
             </w:tr>
           </w:tbl>
@@ -631,7 +657,6 @@
               <w:rPr>
                 <w:b/>
               </w:rPr>
-              <w:lastRenderedPageBreak/>
               <w:t>Target Audience</w:t>
             </w:r>
           </w:p>
@@ -657,7 +682,15 @@
               <w:spacing w:after="40"/>
             </w:pPr>
             <w:r>
-              <w:t>IT and cybersecurity professionals who want to specialise in securing AI/ML systems (e.g., SOC analysts, security engineers, system/network administrators).</w:t>
+              <w:t xml:space="preserve">IT and cybersecurity professionals who want to </w:t>
+            </w:r>
+            <w:proofErr w:type="spellStart"/>
+            <w:r>
+              <w:t>specialise</w:t>
+            </w:r>
+            <w:proofErr w:type="spellEnd"/>
+            <w:r>
+              <w:t xml:space="preserve"> in securing AI/ML systems (e.g., SOC analysts, security engineers, system/network administrators).</w:t>
             </w:r>
           </w:p>
           <w:p>
@@ -675,7 +708,16 @@
               <w:spacing w:after="40"/>
             </w:pPr>
             <w:r>
-              <w:t>Fresh graduates from IT, computer science, data science or engineering programmes who want career-ready AI security skills.</w:t>
+              <w:t xml:space="preserve">Fresh graduates from IT, computer science, data science or engineering </w:t>
+            </w:r>
+            <w:proofErr w:type="spellStart"/>
+            <w:r>
+              <w:lastRenderedPageBreak/>
+              <w:t>programmes</w:t>
+            </w:r>
+            <w:proofErr w:type="spellEnd"/>
+            <w:r>
+              <w:t xml:space="preserve"> who want career-ready AI security skills.</w:t>
             </w:r>
           </w:p>
           <w:p>
@@ -732,6 +774,7 @@
               <w:rPr>
                 <w:b/>
               </w:rPr>
+              <w:lastRenderedPageBreak/>
               <w:t>(For certificate and above qualifications only) – Potential Employment Opportunities upon Course Completion</w:t>
             </w:r>
           </w:p>
@@ -870,7 +913,15 @@
               <w:spacing w:after="40"/>
             </w:pPr>
             <w:r>
-              <w:t>Does the proposed course curriculum follow a foreign or international curriculum through full-time programme at the Primary, Secondary, and/or High School levels (grades 1-12), including self-developed curriculum?</w:t>
+              <w:t xml:space="preserve">Does the proposed course curriculum follow a foreign or international curriculum through full-time </w:t>
+            </w:r>
+            <w:proofErr w:type="spellStart"/>
+            <w:r>
+              <w:t>programme</w:t>
+            </w:r>
+            <w:proofErr w:type="spellEnd"/>
+            <w:r>
+              <w:t xml:space="preserve"> at the Primary, Secondary, and/or High School levels (grades 1-12), including self-developed curriculum?</w:t>
             </w:r>
           </w:p>
         </w:tc>
@@ -1243,7 +1294,15 @@
                     <w:spacing w:after="40"/>
                   </w:pPr>
                   <w:r>
-                    <w:t>Hands-on labs in cloud sandbox / Jupyter / SIEM environments (delivered live online)</w:t>
+                    <w:t xml:space="preserve">Hands-on labs in cloud sandbox / </w:t>
+                  </w:r>
+                  <w:proofErr w:type="spellStart"/>
+                  <w:r>
+                    <w:t>Jupyter</w:t>
+                  </w:r>
+                  <w:proofErr w:type="spellEnd"/>
+                  <w:r>
+                    <w:t xml:space="preserve"> / SIEM environments (delivered live online)</w:t>
                   </w:r>
                 </w:p>
               </w:tc>
@@ -1484,7 +1543,6 @@
               <w:rPr>
                 <w:b/>
               </w:rPr>
-              <w:lastRenderedPageBreak/>
               <w:t>Minimum Entry Requirements</w:t>
             </w:r>
           </w:p>
@@ -1561,7 +1619,11 @@
               <w:spacing w:after="40"/>
             </w:pPr>
             <w:r>
-              <w:t>(For certificate qualifications only) – to be read in conjunction with SSG Advisory 3/2022</w:t>
+              <w:t xml:space="preserve">(For certificate qualifications only) – to </w:t>
+            </w:r>
+            <w:r>
+              <w:lastRenderedPageBreak/>
+              <w:t>be read in conjunction with SSG Advisory 3/2022</w:t>
             </w:r>
           </w:p>
         </w:tc>
@@ -1574,7 +1636,12 @@
               <w:spacing w:after="40"/>
             </w:pPr>
             <w:r>
-              <w:t>Will the PEI issue modular certificate(s) that students can stack towards the award of the Certificate Qualification?</w:t>
+              <w:lastRenderedPageBreak/>
+              <w:t xml:space="preserve">Will the PEI issue modular certificate(s) that students can stack towards the award of the </w:t>
+            </w:r>
+            <w:r>
+              <w:lastRenderedPageBreak/>
+              <w:t>Certificate Qualification?</w:t>
             </w:r>
           </w:p>
           <w:p>
@@ -1799,6 +1866,7 @@
               <w:rPr>
                 <w:b/>
               </w:rPr>
+              <w:lastRenderedPageBreak/>
               <w:t>Articulation Pathway</w:t>
             </w:r>
           </w:p>
@@ -1812,7 +1880,15 @@
               <w:spacing w:after="40"/>
             </w:pPr>
             <w:r>
-              <w:t>Is the proposed course a pathway programme?</w:t>
+              <w:t xml:space="preserve">Is the proposed course a pathway </w:t>
+            </w:r>
+            <w:proofErr w:type="spellStart"/>
+            <w:r>
+              <w:t>programme</w:t>
+            </w:r>
+            <w:proofErr w:type="spellEnd"/>
+            <w:r>
+              <w:t>?</w:t>
             </w:r>
           </w:p>
           <w:p>
@@ -1869,90 +1945,7 @@
               <w:spacing w:after="40"/>
             </w:pPr>
             <w:r>
-              <w:t>The curriculum is self-developed by Tertiary Infotech and aligned to the CompTIA SecAI+ certification framework.</w:t>
-            </w:r>
-          </w:p>
-          <w:p>
-            <w:pPr>
-              <w:spacing w:after="40"/>
-            </w:pPr>
-            <w:r>
-              <w:rPr>
-                <w:b/>
-              </w:rPr>
-              <w:t xml:space="preserve">Reference certification body: </w:t>
-            </w:r>
-            <w:r>
-              <w:t>CompTIA (Computing Technology Industry Association)</w:t>
-            </w:r>
-          </w:p>
-          <w:p>
-            <w:pPr>
-              <w:spacing w:after="40"/>
-            </w:pPr>
-            <w:r>
-              <w:rPr>
-                <w:b/>
-              </w:rPr>
-              <w:t xml:space="preserve">Country of origin: </w:t>
-            </w:r>
-            <w:r>
-              <w:t>USA</w:t>
-            </w:r>
-          </w:p>
-          <w:p>
-            <w:pPr>
-              <w:spacing w:after="40"/>
-            </w:pPr>
-            <w:r>
-              <w:rPr>
-                <w:b/>
-              </w:rPr>
-              <w:t>Status in country of origin (USA):</w:t>
-            </w:r>
-          </w:p>
-          <w:p>
-            <w:pPr>
-              <w:pStyle w:val="ListBullet"/>
-              <w:spacing w:after="40"/>
-            </w:pPr>
-            <w:r>
-              <w:t>Trade Association: CompTIA is a non-profit trade association serving as a collective voice and advocate for the IT industry and its professionals.</w:t>
-            </w:r>
-          </w:p>
-          <w:p>
-            <w:pPr>
-              <w:pStyle w:val="ListBullet"/>
-              <w:spacing w:after="40"/>
-            </w:pPr>
-            <w:r>
-              <w:t>Vendor-Neutral Certification Body: globally recognised, leading provider of vendor-neutral IT certifications validating skills across technology vendors and platforms.</w:t>
-            </w:r>
-          </w:p>
-          <w:p>
-            <w:pPr>
-              <w:pStyle w:val="ListBullet"/>
-              <w:spacing w:after="40"/>
-            </w:pPr>
-            <w:r>
-              <w:t>Established History: founded 1982 (originally the Association of Better Computer Dealers – ABCD); has issued over 3.6 million certifications worldwide.</w:t>
-            </w:r>
-          </w:p>
-          <w:p>
-            <w:pPr>
-              <w:pStyle w:val="ListBullet"/>
-              <w:spacing w:after="40"/>
-            </w:pPr>
-            <w:r>
-              <w:t>Headquarters: Downers Grove, Illinois, USA.</w:t>
-            </w:r>
-          </w:p>
-          <w:p>
-            <w:pPr>
-              <w:spacing w:after="40"/>
-            </w:pPr>
-            <w:r>
-              <w:t>The SecAI+ certification validates skills in securing AI systems, AI-assisted security, and AI governance, risk and compliance.</w:t>
+              <w:t>Not applicable — the course is self-developed by Tertiary Infotech Academy.</w:t>
             </w:r>
           </w:p>
         </w:tc>
@@ -1986,7 +1979,15 @@
               <w:spacing w:after="40"/>
             </w:pPr>
             <w:r>
-              <w:t>Is the proposed course accredited by any external organisation?</w:t>
+              <w:t xml:space="preserve">Is the proposed course accredited by any external </w:t>
+            </w:r>
+            <w:proofErr w:type="spellStart"/>
+            <w:r>
+              <w:t>organisation</w:t>
+            </w:r>
+            <w:proofErr w:type="spellEnd"/>
+            <w:r>
+              <w:t>?</w:t>
             </w:r>
           </w:p>
           <w:p>
@@ -2034,7 +2035,15 @@
               <w:spacing w:after="40"/>
             </w:pPr>
             <w:r>
-              <w:t>Is there any other form of association, collaboration or affiliation with any other organisation or persons, either local or foreign, in respect of this course?</w:t>
+              <w:t xml:space="preserve">Is there any other form of association, collaboration or affiliation with any other </w:t>
+            </w:r>
+            <w:proofErr w:type="spellStart"/>
+            <w:r>
+              <w:t>organisation</w:t>
+            </w:r>
+            <w:proofErr w:type="spellEnd"/>
+            <w:r>
+              <w:t xml:space="preserve"> or persons, either local or foreign, in respect of this course?</w:t>
             </w:r>
           </w:p>
           <w:p>
@@ -2181,7 +2190,6 @@
         <w:spacing w:after="40"/>
       </w:pPr>
       <w:r>
-        <w:lastRenderedPageBreak/>
         <w:t>(c) the assessment methods and procedures for the course have been approved by the Examination Board; and</w:t>
       </w:r>
     </w:p>

</xml_diff>

<commit_message>
Added AB board, sample cert
</commit_message>
<xml_diff>
--- a/01. Advanced Certificate in AI Security Analyst/Advanced Certificate in AI Security Analyst.docx
+++ b/01. Advanced Certificate in AI Security Analyst/Advanced Certificate in AI Security Analyst.docx
@@ -1,5 +1,70 @@
 
-<file path=word/document.xml><?xml version="1.0" encoding="utf-8"?>
+<file path=customXml\item1.xml><?xml version="1.0" encoding="utf-8"?>
+<b:Sources xmlns:b="http://schemas.openxmlformats.org/officeDocument/2006/bibliography" xmlns="http://schemas.openxmlformats.org/officeDocument/2006/bibliography" SelectedStyle="/APA.XSL" StyleName="APA"/>
+</file>
+
+<file path=customXml\itemProps1.xml><?xml version="1.0" encoding="utf-8"?>
+<ds:datastoreItem xmlns:ds="http://schemas.openxmlformats.org/officeDocument/2006/customXml" ds:itemID="{EF278816-EC6F-A645-907D-7F25AECB1D4A}">
+  <ds:schemaRefs>
+    <ds:schemaRef ds:uri="http://schemas.openxmlformats.org/officeDocument/2006/bibliography"/>
+  </ds:schemaRefs>
+</ds:datastoreItem>
+</file>
+
+<file path=docProps\app.xml><?xml version="1.0" encoding="utf-8"?>
+<Properties xmlns="http://schemas.openxmlformats.org/officeDocument/2006/extended-properties" xmlns:vt="http://schemas.openxmlformats.org/officeDocument/2006/docPropsVTypes">
+  <Template>Normal.dotm</Template>
+  <TotalTime>5</TotalTime>
+  <Pages>3</Pages>
+  <Words>1210</Words>
+  <Characters>6897</Characters>
+  <Application>Microsoft Office Word</Application>
+  <DocSecurity>0</DocSecurity>
+  <Lines>57</Lines>
+  <Paragraphs>16</Paragraphs>
+  <ScaleCrop>false</ScaleCrop>
+  <HeadingPairs>
+    <vt:vector size="2" baseType="variant">
+      <vt:variant>
+        <vt:lpstr>Title</vt:lpstr>
+      </vt:variant>
+      <vt:variant>
+        <vt:i4>1</vt:i4>
+      </vt:variant>
+    </vt:vector>
+  </HeadingPairs>
+  <TitlesOfParts>
+    <vt:vector size="1" baseType="lpstr">
+      <vt:lpstr/>
+    </vt:vector>
+  </TitlesOfParts>
+  <Manager/>
+  <Company/>
+  <LinksUpToDate>false</LinksUpToDate>
+  <CharactersWithSpaces>8091</CharactersWithSpaces>
+  <SharedDoc>false</SharedDoc>
+  <HyperlinkBase/>
+  <HyperlinksChanged>false</HyperlinksChanged>
+  <AppVersion>16.0000</AppVersion>
+</Properties>
+</file>
+
+<file path=docProps\core.xml><?xml version="1.0" encoding="utf-8"?>
+<cp:coreProperties xmlns:cp="http://schemas.openxmlformats.org/package/2006/metadata/core-properties" xmlns:dc="http://purl.org/dc/elements/1.1/" xmlns:dcterms="http://purl.org/dc/terms/" xmlns:dcmitype="http://purl.org/dc/dcmitype/" xmlns:xsi="http://www.w3.org/2001/XMLSchema-instance">
+  <dc:title/>
+  <dc:subject/>
+  <dc:creator>python-docx</dc:creator>
+  <cp:keywords/>
+  <dc:description>generated by python-docx</dc:description>
+  <cp:lastModifiedBy>Tertiary Infotech Admin</cp:lastModifiedBy>
+  <cp:revision>4</cp:revision>
+  <dcterms:created xsi:type="dcterms:W3CDTF">2013-12-23T23:15:00Z</dcterms:created>
+  <dcterms:modified xsi:type="dcterms:W3CDTF">2026-06-12T04:24:00Z</dcterms:modified>
+  <cp:category/>
+</cp:coreProperties>
+</file>
+
+<file path=word\document.xml><?xml version="1.0" encoding="utf-8"?>
 <w:document xmlns:wpc="http://schemas.microsoft.com/office/word/2010/wordprocessingCanvas" xmlns:cx="http://schemas.microsoft.com/office/drawing/2014/chartex" xmlns:cx1="http://schemas.microsoft.com/office/drawing/2015/9/8/chartex" xmlns:cx2="http://schemas.microsoft.com/office/drawing/2015/10/21/chartex" xmlns:cx3="http://schemas.microsoft.com/office/drawing/2016/5/9/chartex" xmlns:cx4="http://schemas.microsoft.com/office/drawing/2016/5/10/chartex" xmlns:cx5="http://schemas.microsoft.com/office/drawing/2016/5/11/chartex" xmlns:cx6="http://schemas.microsoft.com/office/drawing/2016/5/12/chartex" xmlns:cx7="http://schemas.microsoft.com/office/drawing/2016/5/13/chartex" xmlns:cx8="http://schemas.microsoft.com/office/drawing/2016/5/14/chartex" xmlns:mc="http://schemas.openxmlformats.org/markup-compatibility/2006" xmlns:aink="http://schemas.microsoft.com/office/drawing/2016/ink" xmlns:am3d="http://schemas.microsoft.com/office/drawing/2017/model3d" xmlns:o="urn:schemas-microsoft-com:office:office" xmlns:oel="http://schemas.microsoft.com/office/2019/extlst" xmlns:r="http://schemas.openxmlformats.org/officeDocument/2006/relationships" xmlns:m="http://schemas.openxmlformats.org/officeDocument/2006/math" xmlns:v="urn:schemas-microsoft-com:vml" xmlns:wp14="http://schemas.microsoft.com/office/word/2010/wordprocessingDrawing" xmlns:wp="http://schemas.openxmlformats.org/drawingml/2006/wordprocessingDrawing" xmlns:w10="urn:schemas-microsoft-com:office:word" xmlns:w="http://schemas.openxmlformats.org/wordprocessingml/2006/main" xmlns:w14="http://schemas.microsoft.com/office/word/2010/wordml" xmlns:w15="http://schemas.microsoft.com/office/word/2012/wordml" xmlns:w16cex="http://schemas.microsoft.com/office/word/2018/wordml/cex" xmlns:w16cid="http://schemas.microsoft.com/office/word/2016/wordml/cid" xmlns:w16="http://schemas.microsoft.com/office/word/2018/wordml" xmlns:w16du="http://schemas.microsoft.com/office/word/2023/wordml/word16du" xmlns:w16sdtdh="http://schemas.microsoft.com/office/word/2020/wordml/sdtdatahash" xmlns:w16sdtfl="http://schemas.microsoft.com/office/word/2024/wordml/sdtformatlock" xmlns:w16se="http://schemas.microsoft.com/office/word/2015/wordml/symex" xmlns:wpg="http://schemas.microsoft.com/office/word/2010/wordprocessingGroup" xmlns:wpi="http://schemas.microsoft.com/office/word/2010/wordprocessingInk" xmlns:wne="http://schemas.microsoft.com/office/word/2006/wordml" xmlns:wps="http://schemas.microsoft.com/office/word/2010/wordprocessingShape" mc:Ignorable="w14 w15 w16se w16cid w16 w16cex w16sdtdh w16sdtfl w16du wp14">
   <w:body>
     <w:p>
@@ -114,21 +179,21 @@
               <w:rPr>
                 <w:i/>
               </w:rPr>
-              <w:t>1. If it is 100% e-learning course, add “(e-learning)” at the end of the course title.</w:t>
+              <w:t>1. If it is 100% e-learning course, add â€œ(e-learning)â€ at the end of the course title.</w:t>
             </w:r>
             <w:r>
               <w:rPr>
                 <w:i/>
               </w:rPr>
               <w:br/>
-              <w:t>2. If conducted in Mandarin, add “(Mandarin)” at the end of the title.</w:t>
+              <w:t>2. If conducted in Mandarin, add â€œ(Mandarin)â€ at the end of the title.</w:t>
             </w:r>
             <w:r>
               <w:rPr>
                 <w:i/>
               </w:rPr>
               <w:br/>
-              <w:t>3. Include prefix “(MC)” for stackable certificate courses.</w:t>
+              <w:t>3. Include prefix â€œ(MC)â€ for stackable certificate courses.</w:t>
             </w:r>
           </w:p>
         </w:tc>
@@ -181,10 +246,10 @@
               <w:rPr>
                 <w:b/>
               </w:rPr>
-              <w:t xml:space="preserve">√ </w:t>
+              <w:t xml:space="preserve">âˆš </w:t>
             </w:r>
             <w:r>
-              <w:t>Self-developed    ☐ Externally-developed    ☐ Jointly-developed</w:t>
+              <w:t>Self-developed    â˜ Externally-developed    â˜ Jointly-developed</w:t>
             </w:r>
           </w:p>
           <w:p>
@@ -375,7 +440,7 @@
               <w:rPr>
                 <w:iCs/>
               </w:rPr>
-              <w:t>Each module is consists of 10 sessions (9 teaching + 1 assessment), conducted live online for 3 days a week, 7:00 PM – 10:00 PM (3 hours per session).</w:t>
+              <w:t>Each module is consists of 10 sessions (9 teaching + 1 assessment), conducted live online for 3 days a week, 7:00 PM â€“ 10:00 PM (3 hours per session).</w:t>
             </w:r>
           </w:p>
           <w:p>
@@ -775,7 +840,7 @@
                 <w:b/>
               </w:rPr>
               <w:lastRenderedPageBreak/>
-              <w:t>(For certificate and above qualifications only) – Potential Employment Opportunities upon Course Completion</w:t>
+              <w:t>(For certificate and above qualifications only) â€“ Potential Employment Opportunities upon Course Completion</w:t>
             </w:r>
           </w:p>
         </w:tc>
@@ -934,13 +999,13 @@
               <w:spacing w:after="40"/>
             </w:pPr>
             <w:r>
-              <w:t xml:space="preserve">☐ Yes    </w:t>
+              <w:t xml:space="preserve">â˜ Yes    </w:t>
             </w:r>
             <w:r>
               <w:rPr>
                 <w:b/>
               </w:rPr>
-              <w:t>√ No</w:t>
+              <w:t>âˆš No</w:t>
             </w:r>
           </w:p>
           <w:p>
@@ -991,7 +1056,7 @@
               <w:t xml:space="preserve">Mode of Delivery:  </w:t>
             </w:r>
             <w:r>
-              <w:t>☐ Face-to-face    ☐ Blended    √ E-learning</w:t>
+              <w:t>â˜ Face-to-face    â˜ Blended    âˆš E-learning</w:t>
             </w:r>
           </w:p>
           <w:p>
@@ -1030,7 +1095,7 @@
               <w:t xml:space="preserve">Class Frequency:  </w:t>
             </w:r>
             <w:r>
-              <w:t>3 days per week  x 3 hours per day (part-time), 7:00 PM – 10:00 PM</w:t>
+              <w:t>3 days per week  x 3 hours per day (part-time), 7:00 PM â€“ 10:00 PM</w:t>
             </w:r>
           </w:p>
           <w:p>
@@ -1559,10 +1624,7 @@
               <w:rPr>
                 <w:b/>
               </w:rPr>
-              <w:t xml:space="preserve">Age: </w:t>
-            </w:r>
-            <w:r>
-              <w:t>21 years old</w:t>
+              <w:t>Age:</w:t>
             </w:r>
           </w:p>
           <w:p>
@@ -1573,10 +1635,7 @@
               <w:rPr>
                 <w:b/>
               </w:rPr>
-              <w:t xml:space="preserve">Language Proficiency: </w:t>
-            </w:r>
-            <w:r>
-              <w:t>At least C6 for GCE “O” Level English</w:t>
+              <w:t>At least 21 years old</w:t>
             </w:r>
           </w:p>
           <w:p>
@@ -1587,10 +1646,7 @@
               <w:rPr>
                 <w:b/>
               </w:rPr>
-              <w:t xml:space="preserve">Academic: </w:t>
-            </w:r>
-            <w:r>
-              <w:t>At least C6 for GCE “O” Level in any 3 subjects</w:t>
+              <w:t>Academic:</w:t>
             </w:r>
           </w:p>
           <w:p>
@@ -1599,9 +1655,20 @@
             </w:pPr>
             <w:r>
               <w:rPr>
-                <w:i/>
+                <w:b/>
               </w:rPr>
-              <w:t>Recommended (not mandatory): basic IT/cybersecurity knowledge (e.g., CompTIA Security+ or equivalent) and basic Python/scripting familiarity.</w:t>
+              <w:t>At least C6 at GCE O-Level in any 3 subjects, or equivalent; or</w:t>
+            </w:r>
+          </w:p>
+          <w:p>
+            <w:pPr>
+              <w:spacing w:after="40"/>
+            </w:pPr>
+            <w:r>
+              <w:rPr>
+                <w:b/>
+              </w:rPr>
+              <w:t>Mature candidate who is at least 25 years old with at least 4 years of working experience</w:t>
             </w:r>
           </w:p>
         </w:tc>
@@ -1619,7 +1686,7 @@
               <w:spacing w:after="40"/>
             </w:pPr>
             <w:r>
-              <w:t xml:space="preserve">(For certificate qualifications only) – to be read in conjunction with SSG </w:t>
+              <w:t xml:space="preserve">(For certificate qualifications only) â€“ to be read in conjunction with SSG </w:t>
             </w:r>
             <w:r>
               <w:lastRenderedPageBreak/>
@@ -1649,10 +1716,10 @@
                 <w:b/>
               </w:rPr>
               <w:lastRenderedPageBreak/>
-              <w:t xml:space="preserve">√ YES    </w:t>
+              <w:t xml:space="preserve">âˆš YES    </w:t>
             </w:r>
             <w:r>
-              <w:t>☐ NO</w:t>
+              <w:t>â˜ NO</w:t>
             </w:r>
           </w:p>
           <w:p>
@@ -1663,7 +1730,7 @@
               <w:rPr>
                 <w:i/>
               </w:rPr>
-              <w:t>Note: Only “Terminal” Certificate Courses can be registered as Modular Courses that stack to a Certificate Qualification.</w:t>
+              <w:t>Note: Only â€œTerminalâ€ Certificate Courses can be registered as Modular Courses that stack to a Certificate Qualification.</w:t>
             </w:r>
           </w:p>
           <w:tbl>
@@ -1893,13 +1960,13 @@
               <w:spacing w:after="40"/>
             </w:pPr>
             <w:r>
-              <w:t xml:space="preserve">☐ YES    </w:t>
+              <w:t xml:space="preserve">â˜ YES    </w:t>
             </w:r>
             <w:r>
               <w:rPr>
                 <w:b/>
               </w:rPr>
-              <w:t>√ NO</w:t>
+              <w:t>âˆš NO</w:t>
             </w:r>
           </w:p>
         </w:tc>
@@ -1942,7 +2009,7 @@
               <w:spacing w:after="40"/>
             </w:pPr>
             <w:r>
-              <w:t>Not applicable — the course is self-developed by Tertiary Infotech Academy.</w:t>
+              <w:t>Not applicable â€” the course is self-developed by Tertiary Infotech Academy.</w:t>
             </w:r>
           </w:p>
         </w:tc>
@@ -1992,13 +2059,13 @@
               <w:spacing w:after="40"/>
             </w:pPr>
             <w:r>
-              <w:t xml:space="preserve">☐ YES    </w:t>
+              <w:t xml:space="preserve">â˜ YES    </w:t>
             </w:r>
             <w:r>
               <w:rPr>
                 <w:b/>
               </w:rPr>
-              <w:t>√ NO</w:t>
+              <w:t>âˆš NO</w:t>
             </w:r>
           </w:p>
         </w:tc>
@@ -2048,13 +2115,13 @@
               <w:spacing w:after="40"/>
             </w:pPr>
             <w:r>
-              <w:t xml:space="preserve">☐ YES    </w:t>
+              <w:t xml:space="preserve">â˜ YES    </w:t>
             </w:r>
             <w:r>
               <w:rPr>
                 <w:b/>
               </w:rPr>
-              <w:t>√ NO</w:t>
+              <w:t>âˆš NO</w:t>
             </w:r>
           </w:p>
         </w:tc>
@@ -2096,13 +2163,13 @@
               <w:spacing w:after="40"/>
             </w:pPr>
             <w:r>
-              <w:t xml:space="preserve">☐ YES    </w:t>
+              <w:t xml:space="preserve">â˜ YES    </w:t>
             </w:r>
             <w:r>
               <w:rPr>
                 <w:b/>
               </w:rPr>
-              <w:t>√ NO</w:t>
+              <w:t>âˆš NO</w:t>
             </w:r>
           </w:p>
         </w:tc>
@@ -2222,7 +2289,69 @@
 </w:document>
 </file>
 
-<file path=word/numbering.xml><?xml version="1.0" encoding="utf-8"?>
+<file path=word\fontTable.xml><?xml version="1.0" encoding="utf-8"?>
+<w:fonts xmlns:mc="http://schemas.openxmlformats.org/markup-compatibility/2006" xmlns:r="http://schemas.openxmlformats.org/officeDocument/2006/relationships" xmlns:w="http://schemas.openxmlformats.org/wordprocessingml/2006/main" xmlns:w14="http://schemas.microsoft.com/office/word/2010/wordml" xmlns:w15="http://schemas.microsoft.com/office/word/2012/wordml" xmlns:w16cex="http://schemas.microsoft.com/office/word/2018/wordml/cex" xmlns:w16cid="http://schemas.microsoft.com/office/word/2016/wordml/cid" xmlns:w16="http://schemas.microsoft.com/office/word/2018/wordml" xmlns:w16du="http://schemas.microsoft.com/office/word/2023/wordml/word16du" xmlns:w16sdtdh="http://schemas.microsoft.com/office/word/2020/wordml/sdtdatahash" xmlns:w16sdtfl="http://schemas.microsoft.com/office/word/2024/wordml/sdtformatlock" xmlns:w16se="http://schemas.microsoft.com/office/word/2015/wordml/symex" mc:Ignorable="w14 w15 w16se w16cid w16 w16cex w16sdtdh w16sdtfl w16du">
+  <w:font w:name="Symbol">
+    <w:panose1 w:val="05050102010706020507"/>
+    <w:charset w:val="02"/>
+    <w:family w:val="roman"/>
+    <w:pitch w:val="variable"/>
+    <w:sig w:usb0="00000000" w:usb1="10000000" w:usb2="00000000" w:usb3="00000000" w:csb0="80000000" w:csb1="00000000"/>
+  </w:font>
+  <w:font w:name="Times New Roman">
+    <w:panose1 w:val="02020603050405020304"/>
+    <w:charset w:val="00"/>
+    <w:family w:val="roman"/>
+    <w:pitch w:val="variable"/>
+    <w:sig w:usb0="E0002EFF" w:usb1="C000785B" w:usb2="00000009" w:usb3="00000000" w:csb0="000001FF" w:csb1="00000000"/>
+  </w:font>
+  <w:font w:name="Cambria">
+    <w:panose1 w:val="02040503050406030204"/>
+    <w:charset w:val="00"/>
+    <w:family w:val="roman"/>
+    <w:pitch w:val="variable"/>
+    <w:sig w:usb0="E00006FF" w:usb1="420024FF" w:usb2="02000000" w:usb3="00000000" w:csb0="0000019F" w:csb1="00000000"/>
+  </w:font>
+  <w:font w:name="MS Mincho">
+    <w:panose1 w:val="02020609040205080304"/>
+    <w:charset w:val="80"/>
+    <w:family w:val="modern"/>
+    <w:pitch w:val="fixed"/>
+    <w:sig w:usb0="E00002FF" w:usb1="6AC7FDFB" w:usb2="08000012" w:usb3="00000000" w:csb0="0002009F" w:csb1="00000000"/>
+  </w:font>
+  <w:font w:name="Arial">
+    <w:panose1 w:val="020B0604020202020204"/>
+    <w:charset w:val="00"/>
+    <w:family w:val="swiss"/>
+    <w:pitch w:val="variable"/>
+    <w:sig w:usb0="E0002EFF" w:usb1="C000785B" w:usb2="00000009" w:usb3="00000000" w:csb0="000001FF" w:csb1="00000000"/>
+  </w:font>
+  <w:font w:name="Calibri">
+    <w:panose1 w:val="020F0502020204030204"/>
+    <w:charset w:val="00"/>
+    <w:family w:val="swiss"/>
+    <w:pitch w:val="variable"/>
+    <w:sig w:usb0="E4002EFF" w:usb1="C200247B" w:usb2="00000009" w:usb3="00000000" w:csb0="000001FF" w:csb1="00000000"/>
+  </w:font>
+  <w:font w:name="MS Gothic">
+    <w:altName w:val="ＭＳ ゴシック"/>
+    <w:panose1 w:val="020B0609070205080204"/>
+    <w:charset w:val="80"/>
+    <w:family w:val="modern"/>
+    <w:pitch w:val="fixed"/>
+    <w:sig w:usb0="E00002FF" w:usb1="6AC7FDFB" w:usb2="08000012" w:usb3="00000000" w:csb0="0002009F" w:csb1="00000000"/>
+  </w:font>
+  <w:font w:name="Courier">
+    <w:panose1 w:val="02070409020205020404"/>
+    <w:charset w:val="00"/>
+    <w:family w:val="auto"/>
+    <w:pitch w:val="variable"/>
+    <w:sig w:usb0="00000003" w:usb1="00000000" w:usb2="00000000" w:usb3="00000000" w:csb0="00000001" w:csb1="00000000"/>
+  </w:font>
+</w:fonts>
+</file>
+
+<file path=word\numbering.xml><?xml version="1.0" encoding="utf-8"?>
 <w:numbering xmlns:wpc="http://schemas.microsoft.com/office/word/2010/wordprocessingCanvas" xmlns:cx="http://schemas.microsoft.com/office/drawing/2014/chartex" xmlns:cx1="http://schemas.microsoft.com/office/drawing/2015/9/8/chartex" xmlns:cx2="http://schemas.microsoft.com/office/drawing/2015/10/21/chartex" xmlns:cx3="http://schemas.microsoft.com/office/drawing/2016/5/9/chartex" xmlns:cx4="http://schemas.microsoft.com/office/drawing/2016/5/10/chartex" xmlns:cx5="http://schemas.microsoft.com/office/drawing/2016/5/11/chartex" xmlns:cx6="http://schemas.microsoft.com/office/drawing/2016/5/12/chartex" xmlns:cx7="http://schemas.microsoft.com/office/drawing/2016/5/13/chartex" xmlns:cx8="http://schemas.microsoft.com/office/drawing/2016/5/14/chartex" xmlns:mc="http://schemas.openxmlformats.org/markup-compatibility/2006" xmlns:aink="http://schemas.microsoft.com/office/drawing/2016/ink" xmlns:am3d="http://schemas.microsoft.com/office/drawing/2017/model3d" xmlns:o="urn:schemas-microsoft-com:office:office" xmlns:oel="http://schemas.microsoft.com/office/2019/extlst" xmlns:r="http://schemas.openxmlformats.org/officeDocument/2006/relationships" xmlns:m="http://schemas.openxmlformats.org/officeDocument/2006/math" xmlns:v="urn:schemas-microsoft-com:vml" xmlns:wp14="http://schemas.microsoft.com/office/word/2010/wordprocessingDrawing" xmlns:wp="http://schemas.openxmlformats.org/drawingml/2006/wordprocessingDrawing" xmlns:w10="urn:schemas-microsoft-com:office:word" xmlns:w="http://schemas.openxmlformats.org/wordprocessingml/2006/main" xmlns:w14="http://schemas.microsoft.com/office/word/2010/wordml" xmlns:w15="http://schemas.microsoft.com/office/word/2012/wordml" xmlns:w16cex="http://schemas.microsoft.com/office/word/2018/wordml/cex" xmlns:w16cid="http://schemas.microsoft.com/office/word/2016/wordml/cid" xmlns:w16="http://schemas.microsoft.com/office/word/2018/wordml" xmlns:w16du="http://schemas.microsoft.com/office/word/2023/wordml/word16du" xmlns:w16sdtdh="http://schemas.microsoft.com/office/word/2020/wordml/sdtdatahash" xmlns:w16sdtfl="http://schemas.microsoft.com/office/word/2024/wordml/sdtformatlock" xmlns:w16se="http://schemas.microsoft.com/office/word/2015/wordml/symex" xmlns:wpg="http://schemas.microsoft.com/office/word/2010/wordprocessingGroup" xmlns:wpi="http://schemas.microsoft.com/office/word/2010/wordprocessingInk" xmlns:wne="http://schemas.microsoft.com/office/word/2006/wordml" xmlns:wps="http://schemas.microsoft.com/office/word/2010/wordprocessingShape" mc:Ignorable="w14 w15 w16se w16cid w16 w16cex w16sdtdh w16sdtfl w16du wp14">
   <w:abstractNum w:abstractNumId="0" w15:restartNumberingAfterBreak="0">
     <w:nsid w:val="FFFFFF7C"/>
@@ -2425,7 +2554,72 @@
 </w:numbering>
 </file>
 
-<file path=word/styles.xml><?xml version="1.0" encoding="utf-8"?>
+<file path=word\settings.xml><?xml version="1.0" encoding="utf-8"?>
+<w:settings xmlns:mc="http://schemas.openxmlformats.org/markup-compatibility/2006" xmlns:o="urn:schemas-microsoft-com:office:office" xmlns:r="http://schemas.openxmlformats.org/officeDocument/2006/relationships" xmlns:m="http://schemas.openxmlformats.org/officeDocument/2006/math" xmlns:v="urn:schemas-microsoft-com:vml" xmlns:w10="urn:schemas-microsoft-com:office:word" xmlns:w="http://schemas.openxmlformats.org/wordprocessingml/2006/main" xmlns:w14="http://schemas.microsoft.com/office/word/2010/wordml" xmlns:w15="http://schemas.microsoft.com/office/word/2012/wordml" xmlns:w16cex="http://schemas.microsoft.com/office/word/2018/wordml/cex" xmlns:w16cid="http://schemas.microsoft.com/office/word/2016/wordml/cid" xmlns:w16="http://schemas.microsoft.com/office/word/2018/wordml" xmlns:w16du="http://schemas.microsoft.com/office/word/2023/wordml/word16du" xmlns:w16sdtdh="http://schemas.microsoft.com/office/word/2020/wordml/sdtdatahash" xmlns:w16sdtfl="http://schemas.microsoft.com/office/word/2024/wordml/sdtformatlock" xmlns:w16se="http://schemas.microsoft.com/office/word/2015/wordml/symex" xmlns:sl="http://schemas.openxmlformats.org/schemaLibrary/2006/main" mc:Ignorable="w14 w15 w16se w16cid w16 w16cex w16sdtdh w16sdtfl w16du">
+  <w:zoom w:percent="100"/>
+  <w:doNotDisplayPageBoundaries/>
+  <w:proofState w:spelling="clean"/>
+  <w:defaultTabStop w:val="720"/>
+  <w:characterSpacingControl w:val="doNotCompress"/>
+  <w:compat>
+    <w:useFELayout/>
+    <w:compatSetting w:name="compatibilityMode" w:uri="http://schemas.microsoft.com/office/word" w:val="14"/>
+    <w:compatSetting w:name="overrideTableStyleFontSizeAndJustification" w:uri="http://schemas.microsoft.com/office/word" w:val="1"/>
+    <w:compatSetting w:name="enableOpenTypeFeatures" w:uri="http://schemas.microsoft.com/office/word" w:val="1"/>
+    <w:compatSetting w:name="doNotFlipMirrorIndents" w:uri="http://schemas.microsoft.com/office/word" w:val="1"/>
+    <w:compatSetting w:name="useWord2013TrackBottomHyphenation" w:uri="http://schemas.microsoft.com/office/word" w:val="1"/>
+  </w:compat>
+  <w:rsids>
+    <w:rsidRoot w:val="00B47730"/>
+    <w:rsid w:val="00034616"/>
+    <w:rsid w:val="0006063C"/>
+    <w:rsid w:val="0015074B"/>
+    <w:rsid w:val="00266592"/>
+    <w:rsid w:val="0029639D"/>
+    <w:rsid w:val="00326F90"/>
+    <w:rsid w:val="00344F76"/>
+    <w:rsid w:val="003875C3"/>
+    <w:rsid w:val="00392B9B"/>
+    <w:rsid w:val="004622FD"/>
+    <w:rsid w:val="00866565"/>
+    <w:rsid w:val="00AA1D8D"/>
+    <w:rsid w:val="00B47730"/>
+    <w:rsid w:val="00B70619"/>
+    <w:rsid w:val="00CB0664"/>
+    <w:rsid w:val="00D56AF4"/>
+    <w:rsid w:val="00FC693F"/>
+  </w:rsids>
+  <m:mathPr>
+    <m:mathFont m:val="Cambria Math"/>
+    <m:brkBin m:val="before"/>
+    <m:brkBinSub m:val="--"/>
+    <m:smallFrac m:val="0"/>
+    <m:dispDef/>
+    <m:lMargin m:val="0"/>
+    <m:rMargin m:val="0"/>
+    <m:defJc m:val="centerGroup"/>
+    <m:wrapIndent m:val="1440"/>
+    <m:intLim m:val="subSup"/>
+    <m:naryLim m:val="undOvr"/>
+  </m:mathPr>
+  <w:themeFontLang w:val="en-US" w:eastAsia="ja-JP"/>
+  <w:clrSchemeMapping w:bg1="light1" w:t1="dark1" w:bg2="light2" w:t2="dark2" w:accent1="accent1" w:accent2="accent2" w:accent3="accent3" w:accent4="accent4" w:accent5="accent5" w:accent6="accent6" w:hyperlink="hyperlink" w:followedHyperlink="followedHyperlink"/>
+  <w:doNotAutoCompressPictures/>
+  <w:shapeDefaults>
+    <o:shapedefaults v:ext="edit" spidmax="1026"/>
+    <o:shapelayout v:ext="edit">
+      <o:idmap v:ext="edit" data="1"/>
+    </o:shapelayout>
+  </w:shapeDefaults>
+  <w:decimalSymbol w:val="."/>
+  <w:listSeparator w:val=","/>
+  <w14:docId w14:val="6FE97190"/>
+  <w14:defaultImageDpi w14:val="300"/>
+  <w15:docId w15:val="{AFB06239-F829-45B6-AB73-6B193FBC9D3F}"/>
+</w:settings>
+</file>
+
+<file path=word\styles.xml><?xml version="1.0" encoding="utf-8"?>
 <w:styles xmlns:mc="http://schemas.openxmlformats.org/markup-compatibility/2006" xmlns:r="http://schemas.openxmlformats.org/officeDocument/2006/relationships" xmlns:w="http://schemas.openxmlformats.org/wordprocessingml/2006/main" xmlns:w14="http://schemas.microsoft.com/office/word/2010/wordml" xmlns:w15="http://schemas.microsoft.com/office/word/2012/wordml" xmlns:w16cex="http://schemas.microsoft.com/office/word/2018/wordml/cex" xmlns:w16cid="http://schemas.microsoft.com/office/word/2016/wordml/cid" xmlns:w16="http://schemas.microsoft.com/office/word/2018/wordml" xmlns:w16du="http://schemas.microsoft.com/office/word/2023/wordml/word16du" xmlns:w16sdtdh="http://schemas.microsoft.com/office/word/2020/wordml/sdtdatahash" xmlns:w16sdtfl="http://schemas.microsoft.com/office/word/2024/wordml/sdtformatlock" xmlns:w16se="http://schemas.microsoft.com/office/word/2015/wordml/symex" mc:Ignorable="w14 w15 w16se w16cid w16 w16cex w16sdtdh w16sdtfl w16du">
   <w:docDefaults>
     <w:rPrDefault>
@@ -13811,7 +14005,7 @@
 </w:styles>
 </file>
 
-<file path=word/theme/theme1.xml><?xml version="1.0" encoding="utf-8"?>
+<file path=word\theme\theme1.xml><?xml version="1.0" encoding="utf-8"?>
 <a:theme xmlns:a="http://schemas.openxmlformats.org/drawingml/2006/main" name="Office Theme">
   <a:themeElements>
     <a:clrScheme name="Office">
@@ -14131,14 +14325,8 @@
 </a:theme>
 </file>
 
-<file path=customXml/item1.xml><?xml version="1.0" encoding="utf-8"?>
-<b:Sources xmlns:b="http://schemas.openxmlformats.org/officeDocument/2006/bibliography" xmlns="http://schemas.openxmlformats.org/officeDocument/2006/bibliography" SelectedStyle="/APA.XSL" StyleName="APA"/>
-</file>
-
-<file path=customXml/itemProps1.xml><?xml version="1.0" encoding="utf-8"?>
-<ds:datastoreItem xmlns:ds="http://schemas.openxmlformats.org/officeDocument/2006/customXml" ds:itemID="{EF278816-EC6F-A645-907D-7F25AECB1D4A}">
-  <ds:schemaRefs>
-    <ds:schemaRef ds:uri="http://schemas.openxmlformats.org/officeDocument/2006/bibliography"/>
-  </ds:schemaRefs>
-</ds:datastoreItem>
+<file path=word\webSettings.xml><?xml version="1.0" encoding="utf-8"?>
+<w:webSettings xmlns:mc="http://schemas.openxmlformats.org/markup-compatibility/2006" xmlns:r="http://schemas.openxmlformats.org/officeDocument/2006/relationships" xmlns:w="http://schemas.openxmlformats.org/wordprocessingml/2006/main" xmlns:w14="http://schemas.microsoft.com/office/word/2010/wordml" xmlns:w15="http://schemas.microsoft.com/office/word/2012/wordml" xmlns:w16cex="http://schemas.microsoft.com/office/word/2018/wordml/cex" xmlns:w16cid="http://schemas.microsoft.com/office/word/2016/wordml/cid" xmlns:w16="http://schemas.microsoft.com/office/word/2018/wordml" xmlns:w16du="http://schemas.microsoft.com/office/word/2023/wordml/word16du" xmlns:w16sdtdh="http://schemas.microsoft.com/office/word/2020/wordml/sdtdatahash" xmlns:w16sdtfl="http://schemas.microsoft.com/office/word/2024/wordml/sdtformatlock" xmlns:w16se="http://schemas.microsoft.com/office/word/2015/wordml/symex" mc:Ignorable="w14 w15 w16se w16cid w16 w16cex w16sdtdh w16sdtfl w16du">
+  <w:allowPNG/>
+</w:webSettings>
 </file>
</xml_diff>